<commit_message>
Erasmo Carlos: revisão da Parte 4
Co-Authored-By: Claude Opus 5.5 <noreply@anthropic.com>
Claude-Session: https://claude.ai/code/session_01MJjUEEZrxQDEUifKK2vj9g
</commit_message>
<xml_diff>
--- a/roteiros/erasmo-carlos/Erasmo_Parte4.docx
+++ b/roteiros/erasmo-carlos/Erasmo_Parte4.docx
@@ -31,7 +31,7 @@
         <w:rPr>
           <w:color w:val="000000"/>
         </w:rPr>
-        <w:t>O boato com Roberta Close foi perdendo força nas bancas, como acontece com quase todo boato. A imprensa encontrou outros assuntos.</w:t>
+        <w:t>Com o tempo, a imprensa encontrou outros assuntos.</w:t>
       </w:r>
     </w:p>
     <w:p>
@@ -39,7 +39,7 @@
         <w:rPr>
           <w:color w:val="000000"/>
         </w:rPr>
-        <w:t>A família Esteves tentou seguir como se aquele dia de junho nunca tivesse existido.</w:t>
+        <w:t>Por fora, a família Esteves seguiu como se aquele dia de junho nunca tivesse existido.</w:t>
       </w:r>
     </w:p>
     <w:p>
@@ -119,7 +119,7 @@
         <w:rPr>
           <w:color w:val="000000"/>
         </w:rPr>
-        <w:t>O homem que tinha feito o Brasil inteiro cantar nos anos sessenta estava ali, diante de uma multidão, sendo atingido por latas atiradas da plateia.</w:t>
+        <w:t>O homem que tinha feito o Brasil inteiro cantar nos anos sessenta estava ali, virando alvo da própria plateia.</w:t>
       </w:r>
     </w:p>
     <w:p>
@@ -199,15 +199,7 @@
         <w:rPr>
           <w:color w:val="000000"/>
         </w:rPr>
-        <w:t>Os meninos já eram rapazes.</w:t>
-      </w:r>
-    </w:p>
-    <w:p>
-      <w:r>
-        <w:rPr>
-          <w:color w:val="000000"/>
-        </w:rPr>
-        <w:t>Narinha continuou vivendo no Rio de Janeiro. Erasmo seguiu com a carreira.</w:t>
+        <w:t>Os meninos já eram rapazes. Erasmo seguiu com a carreira.</w:t>
       </w:r>
     </w:p>
     <w:p>
@@ -335,7 +327,7 @@
         <w:rPr>
           <w:color w:val="C00000"/>
         </w:rPr>
-        <w:t>E é impossível ouvir isso sem lembrar daquele dia de junho de mil novecentos e oitenta e quatro. A própria Narinha disse que o tiro foi um acidente. A polícia aceitou a versão dela. E ninguém nunca contou publicamente quando foram aquelas outras tentativas.</w:t>
+        <w:t>É impossível ouvir isso sem lembrar daquele dia de junho de mil novecentos e oitenta e quatro. A própria Narinha disse que o tiro foi um acidente, e a polícia aceitou a versão dela.</w:t>
       </w:r>
     </w:p>
     <w:p>

</xml_diff>